<commit_message>
docs: finalizar documento tecnico de entrega
</commit_message>
<xml_diff>
--- a/docs/Documento_tecnico_RaidU_actualizado.docx
+++ b/docs/Documento_tecnico_RaidU_actualizado.docx
@@ -44,7 +44,7 @@
         <w:rPr>
           <w:b/>
         </w:rPr>
-        <w:t>Evidencia registrada  84 pruebas automatizadas aprobadas y Postman con 75 solicitudes y 97 aserciones sin fallos. Son resultados conservados en el repositorio, no una ejecución nueva de esta revisión. La instalación limpia corresponde a versiones anteriores. La aprobación cruzada humana sigue pendiente.</w:t>
+        <w:t>Evidencia registrada  84 pruebas automatizadas aprobadas y Postman con 75 solicitudes y 97 aserciones sin fallos. Ambas comprobaciones se repitieron el 29 de octubre tras limitar los vehículos a cinco pasajeros. Los comentarios de revisión están publicados y enlazados en docs/revision-cruzada.md; su alcance se distingue de la ejecución de pruebas.</w:t>
       </w:r>
     </w:p>
     <w:p>
@@ -7611,7 +7611,7 @@
         <w:pageBreakBefore w:val="0"/>
       </w:pPr>
       <w:r>
-        <w:t>Las evidencias guardadas corresponden al 28 de octubre de 2026. Esta revisión documental del 29 de octubre contrasta modelos, rutas, consultas ORM y permisos con el código local. No repite las pruebas ni acredita revisión humana de ambos integrantes.</w:t>
+        <w:t>Las evidencias iniciales corresponden al 28 de octubre de 2026. El 29 de octubre se repitieron las 84 pruebas y las 75 solicitudes con 97 aserciones tras el cambio de capacidad, sin fallos. La constancia adicional está en docs/evidencia-capacidad-cinco.txt. Los comentarios de revisión describen lectura de código y no acreditan nuevas pruebas ejecutadas por la compañera.</w:t>
       </w:r>
     </w:p>
     <w:tbl>
@@ -8201,7 +8201,7 @@
         <w:rPr>
           <w:b w:val="0"/>
         </w:rPr>
-        <w:t>El código local revisado corresponde a 952c21c. La evidencia de 84 pruebas identifica la ampliación administrativa publicada en 6d5550a. El registro de cierre informa la integración de los PR 4, 8 y 6. La instalación limpia registrada precede a la ampliación administrativa; no acredita una instalación nueva del commit final.</w:t>
+        <w:t>La integración a main está realizada. El cambio de capacidad de uno a cinco pasajeros se publicó en 4ae52ea, con migración y comprobaciones aprobadas. Las evidencias de instalación limpia corresponden a versiones anteriores; la ejecución de Postman del nuevo límite sí utilizó MySQL temporal y migraciones desde cero.</w:t>
       </w:r>
     </w:p>
     <w:p>
@@ -8209,7 +8209,7 @@
         <w:pStyle w:val="Heading2"/>
       </w:pPr>
       <w:r>
-        <w:t>Qué falta para entregar</w:t>
+        <w:t>Estado de entrega y revisión</w:t>
       </w:r>
     </w:p>
     <w:p>
@@ -8217,7 +8217,7 @@
         <w:rPr>
           <w:b w:val="0"/>
         </w:rPr>
-        <w:t>La integración a main y la publicación del documento actualizado ya están realizadas. Kendalumana confirmó la autorización del docente para trabajar en pareja; el repositorio es público y el enlace funciona. Queda completar la constancia de revisión personal de ambos y confirmar la subida de entrega.txt a Mediación Virtual con su comprobante.</w:t>
+        <w:t>El documento técnico y el código están publicados en main. La autorización del docente para trabajar en pareja fue confirmada por Kendalumana; el repositorio es público. Los comentarios de Kendalumana y yulianaurena están enlazados en docs/revision-cruzada.md. La revisión de Yuliana corresponde a f6c518d, anterior al límite de cinco pasajeros. La entrega en Mediación se completa subiendo entrega.txt y conservando el comprobante.</w:t>
       </w:r>
     </w:p>
     <w:p>

</xml_diff>